<commit_message>
Laporan: tambah cover kelompok sesuai format UPN
</commit_message>
<xml_diff>
--- a/docs/laporan/Tubes_DL_Kelompok01_Oil_Spill_SAR.docx
+++ b/docs/laporan/Tubes_DL_Kelompok01_Oil_Spill_SAR.docx
@@ -4,6 +4,508 @@
   <w:body>
     <w:p>
       <w:pPr>
+        <w:spacing w:before="480" w:after="0" w:line="240" w:lineRule="auto"/>
+        <w:jc w:val="center"/>
+      </w:pPr>
+      <w:r>
+        <w:rPr>
+          <w:b/>
+          <w:i w:val="0"/>
+          <w:sz w:val="32"/>
+        </w:rPr>
+        <w:t>LAPORAN TUGAS BESAR</w:t>
+      </w:r>
+    </w:p>
+    <w:p>
+      <w:pPr>
+        <w:spacing w:before="0" w:after="360" w:line="240" w:lineRule="auto"/>
+        <w:jc w:val="center"/>
+      </w:pPr>
+      <w:r>
+        <w:rPr>
+          <w:b/>
+          <w:i w:val="0"/>
+          <w:sz w:val="28"/>
+        </w:rPr>
+        <w:t>DEEP LEARNING</w:t>
+      </w:r>
+    </w:p>
+    <w:p>
+      <w:pPr>
+        <w:spacing w:before="0" w:after="0" w:line="240" w:lineRule="auto"/>
+        <w:jc w:val="center"/>
+      </w:pPr>
+      <w:r>
+        <w:rPr>
+          <w:b/>
+          <w:i w:val="0"/>
+          <w:sz w:val="26"/>
+        </w:rPr>
+        <w:t>Deteksi dan Pemetaan Tumpahan Minyak pada Citra Sentinel-1 SAR</w:t>
+      </w:r>
+    </w:p>
+    <w:p>
+      <w:pPr>
+        <w:spacing w:before="0" w:after="0" w:line="240" w:lineRule="auto"/>
+        <w:jc w:val="center"/>
+      </w:pPr>
+      <w:r>
+        <w:rPr>
+          <w:b/>
+          <w:i w:val="0"/>
+          <w:sz w:val="26"/>
+        </w:rPr>
+        <w:t>Menggunakan U-Net Ringan Terkuantisasi INT8</w:t>
+      </w:r>
+    </w:p>
+    <w:p>
+      <w:pPr>
+        <w:spacing w:before="0" w:after="80" w:line="240" w:lineRule="auto"/>
+        <w:jc w:val="center"/>
+      </w:pPr>
+      <w:r>
+        <w:rPr>
+          <w:b/>
+          <w:i w:val="0"/>
+          <w:sz w:val="26"/>
+        </w:rPr>
+        <w:t>untuk Inferensi Edge di Browser</w:t>
+      </w:r>
+    </w:p>
+    <w:p>
+      <w:pPr>
+        <w:spacing w:before="0" w:after="440" w:line="240" w:lineRule="auto"/>
+        <w:jc w:val="center"/>
+      </w:pPr>
+      <w:r>
+        <w:rPr>
+          <w:b w:val="0"/>
+          <w:i w:val="0"/>
+          <w:sz w:val="22"/>
+        </w:rPr>
+        <w:t>(Kasus 38: Marine Oil Spill Detection and Mapping via Satellite SAR)</w:t>
+      </w:r>
+    </w:p>
+    <w:p>
+      <w:pPr>
+        <w:spacing w:after="400"/>
+        <w:jc w:val="center"/>
+      </w:pPr>
+      <w:r>
+        <w:drawing>
+          <wp:inline xmlns:a="http://schemas.openxmlformats.org/drawingml/2006/main" xmlns:pic="http://schemas.openxmlformats.org/drawingml/2006/picture">
+            <wp:extent cx="1872000" cy="1834077"/>
+            <wp:docPr id="1" name="Picture 1"/>
+            <wp:cNvGraphicFramePr>
+              <a:graphicFrameLocks noChangeAspect="1"/>
+            </wp:cNvGraphicFramePr>
+            <a:graphic>
+              <a:graphicData uri="http://schemas.openxmlformats.org/drawingml/2006/picture">
+                <pic:pic>
+                  <pic:nvPicPr>
+                    <pic:cNvPr id="0" name="logo_upnvjt.png"/>
+                    <pic:cNvPicPr/>
+                  </pic:nvPicPr>
+                  <pic:blipFill>
+                    <a:blip r:embed="rId9"/>
+                    <a:stretch>
+                      <a:fillRect/>
+                    </a:stretch>
+                  </pic:blipFill>
+                  <pic:spPr>
+                    <a:xfrm>
+                      <a:off x="0" y="0"/>
+                      <a:ext cx="1872000" cy="1834077"/>
+                    </a:xfrm>
+                    <a:prstGeom prst="rect"/>
+                  </pic:spPr>
+                </pic:pic>
+              </a:graphicData>
+            </a:graphic>
+          </wp:inline>
+        </w:drawing>
+      </w:r>
+    </w:p>
+    <w:p>
+      <w:pPr>
+        <w:spacing w:before="0" w:after="40" w:line="240" w:lineRule="auto"/>
+        <w:jc w:val="center"/>
+      </w:pPr>
+      <w:r>
+        <w:rPr>
+          <w:b w:val="0"/>
+          <w:i w:val="0"/>
+          <w:sz w:val="24"/>
+        </w:rPr>
+        <w:t>Disusun oleh:</w:t>
+      </w:r>
+    </w:p>
+    <w:p>
+      <w:pPr>
+        <w:spacing w:before="0" w:after="120" w:line="240" w:lineRule="auto"/>
+        <w:jc w:val="center"/>
+      </w:pPr>
+      <w:r>
+        <w:rPr>
+          <w:b/>
+          <w:i w:val="0"/>
+          <w:sz w:val="24"/>
+        </w:rPr>
+        <w:t>Kelompok 1 — CAYMAN</w:t>
+      </w:r>
+    </w:p>
+    <w:tbl>
+      <w:tblPr>
+        <w:tblW w:type="auto" w:w="0"/>
+        <w:jc w:val="center"/>
+        <w:tblLayout w:type="fixed"/>
+        <w:tblLook w:firstColumn="1" w:firstRow="1" w:lastColumn="0" w:lastRow="0" w:noHBand="0" w:noVBand="1" w:val="04A0"/>
+      </w:tblPr>
+      <w:tblGrid>
+        <w:gridCol w:w="4536"/>
+        <w:gridCol w:w="4536"/>
+      </w:tblGrid>
+      <w:tr>
+        <w:tc>
+          <w:tcPr>
+            <w:tcW w:type="dxa" w:w="3969"/>
+          </w:tcPr>
+          <w:p>
+            <w:pPr>
+              <w:spacing w:after="20" w:line="240" w:lineRule="auto"/>
+              <w:jc w:val="left"/>
+            </w:pPr>
+            <w:r>
+              <w:rPr>
+                <w:sz w:val="23"/>
+              </w:rPr>
+              <w:t>Ade Rizky Darmawan (Ketua)</w:t>
+            </w:r>
+          </w:p>
+        </w:tc>
+        <w:tc>
+          <w:tcPr>
+            <w:tcW w:type="dxa" w:w="2381"/>
+          </w:tcPr>
+          <w:p>
+            <w:pPr>
+              <w:spacing w:after="20" w:line="240" w:lineRule="auto"/>
+              <w:jc w:val="left"/>
+            </w:pPr>
+            <w:r>
+              <w:rPr>
+                <w:sz w:val="23"/>
+              </w:rPr>
+              <w:t>NPM : 23083010080</w:t>
+            </w:r>
+          </w:p>
+        </w:tc>
+      </w:tr>
+      <w:tr>
+        <w:tc>
+          <w:tcPr>
+            <w:tcW w:type="dxa" w:w="3969"/>
+          </w:tcPr>
+          <w:p>
+            <w:pPr>
+              <w:spacing w:after="20" w:line="240" w:lineRule="auto"/>
+              <w:jc w:val="left"/>
+            </w:pPr>
+            <w:r>
+              <w:rPr>
+                <w:sz w:val="23"/>
+              </w:rPr>
+              <w:t>Arkananta Daniswara Handoyo</w:t>
+            </w:r>
+          </w:p>
+        </w:tc>
+        <w:tc>
+          <w:tcPr>
+            <w:tcW w:type="dxa" w:w="2381"/>
+          </w:tcPr>
+          <w:p>
+            <w:pPr>
+              <w:spacing w:after="20" w:line="240" w:lineRule="auto"/>
+              <w:jc w:val="left"/>
+            </w:pPr>
+            <w:r>
+              <w:rPr>
+                <w:sz w:val="23"/>
+              </w:rPr>
+              <w:t>NPM : 23083010059</w:t>
+            </w:r>
+          </w:p>
+        </w:tc>
+      </w:tr>
+      <w:tr>
+        <w:tc>
+          <w:tcPr>
+            <w:tcW w:type="dxa" w:w="3969"/>
+          </w:tcPr>
+          <w:p>
+            <w:pPr>
+              <w:spacing w:after="20" w:line="240" w:lineRule="auto"/>
+              <w:jc w:val="left"/>
+            </w:pPr>
+            <w:r>
+              <w:rPr>
+                <w:sz w:val="23"/>
+              </w:rPr>
+              <w:t>Muhammad Arsyad Alzam</w:t>
+            </w:r>
+          </w:p>
+        </w:tc>
+        <w:tc>
+          <w:tcPr>
+            <w:tcW w:type="dxa" w:w="2381"/>
+          </w:tcPr>
+          <w:p>
+            <w:pPr>
+              <w:spacing w:after="20" w:line="240" w:lineRule="auto"/>
+              <w:jc w:val="left"/>
+            </w:pPr>
+            <w:r>
+              <w:rPr>
+                <w:sz w:val="23"/>
+              </w:rPr>
+              <w:t>NPM : 23083010082</w:t>
+            </w:r>
+          </w:p>
+        </w:tc>
+      </w:tr>
+      <w:tr>
+        <w:tc>
+          <w:tcPr>
+            <w:tcW w:type="dxa" w:w="3969"/>
+          </w:tcPr>
+          <w:p>
+            <w:pPr>
+              <w:spacing w:after="20" w:line="240" w:lineRule="auto"/>
+              <w:jc w:val="left"/>
+            </w:pPr>
+            <w:r>
+              <w:rPr>
+                <w:sz w:val="23"/>
+              </w:rPr>
+              <w:t>Choirul Amin</w:t>
+            </w:r>
+          </w:p>
+        </w:tc>
+        <w:tc>
+          <w:tcPr>
+            <w:tcW w:type="dxa" w:w="2381"/>
+          </w:tcPr>
+          <w:p>
+            <w:pPr>
+              <w:spacing w:after="20" w:line="240" w:lineRule="auto"/>
+              <w:jc w:val="left"/>
+            </w:pPr>
+            <w:r>
+              <w:rPr>
+                <w:sz w:val="23"/>
+              </w:rPr>
+              <w:t>NPM : 22083010050</w:t>
+            </w:r>
+          </w:p>
+        </w:tc>
+      </w:tr>
+      <w:tr>
+        <w:tc>
+          <w:tcPr>
+            <w:tcW w:type="dxa" w:w="3969"/>
+          </w:tcPr>
+          <w:p>
+            <w:pPr>
+              <w:spacing w:after="20" w:line="240" w:lineRule="auto"/>
+              <w:jc w:val="left"/>
+            </w:pPr>
+            <w:r>
+              <w:rPr>
+                <w:sz w:val="23"/>
+              </w:rPr>
+              <w:t>Hana Titania Sastrian</w:t>
+            </w:r>
+          </w:p>
+        </w:tc>
+        <w:tc>
+          <w:tcPr>
+            <w:tcW w:type="dxa" w:w="2381"/>
+          </w:tcPr>
+          <w:p>
+            <w:pPr>
+              <w:spacing w:after="20" w:line="240" w:lineRule="auto"/>
+              <w:jc w:val="left"/>
+            </w:pPr>
+            <w:r>
+              <w:rPr>
+                <w:sz w:val="23"/>
+              </w:rPr>
+              <w:t>NPM : 23083010056</w:t>
+            </w:r>
+          </w:p>
+        </w:tc>
+      </w:tr>
+      <w:tr>
+        <w:tc>
+          <w:tcPr>
+            <w:tcW w:type="dxa" w:w="3969"/>
+          </w:tcPr>
+          <w:p>
+            <w:pPr>
+              <w:spacing w:after="20" w:line="240" w:lineRule="auto"/>
+              <w:jc w:val="left"/>
+            </w:pPr>
+            <w:r>
+              <w:rPr>
+                <w:sz w:val="23"/>
+              </w:rPr>
+              <w:t>Zaydan Arief Athallah</w:t>
+            </w:r>
+          </w:p>
+        </w:tc>
+        <w:tc>
+          <w:tcPr>
+            <w:tcW w:type="dxa" w:w="2381"/>
+          </w:tcPr>
+          <w:p>
+            <w:pPr>
+              <w:spacing w:after="20" w:line="240" w:lineRule="auto"/>
+              <w:jc w:val="left"/>
+            </w:pPr>
+            <w:r>
+              <w:rPr>
+                <w:sz w:val="23"/>
+              </w:rPr>
+              <w:t>NPM : 23083010063</w:t>
+            </w:r>
+          </w:p>
+        </w:tc>
+      </w:tr>
+    </w:tbl>
+    <w:p>
+      <w:pPr>
+        <w:spacing w:before="320" w:after="0" w:line="240" w:lineRule="auto"/>
+        <w:jc w:val="center"/>
+      </w:pPr>
+      <w:r>
+        <w:rPr>
+          <w:b w:val="0"/>
+          <w:i w:val="0"/>
+          <w:sz w:val="24"/>
+        </w:rPr>
+        <w:t>Dosen Pengampu:</w:t>
+      </w:r>
+    </w:p>
+    <w:p>
+      <w:pPr>
+        <w:spacing w:before="0" w:after="120" w:line="240" w:lineRule="auto"/>
+        <w:jc w:val="center"/>
+      </w:pPr>
+      <w:r>
+        <w:rPr>
+          <w:b w:val="0"/>
+          <w:i w:val="0"/>
+          <w:sz w:val="24"/>
+        </w:rPr>
+        <w:t>Dr. I Gede Susrama Mas Diyasa, ST., MT.</w:t>
+      </w:r>
+    </w:p>
+    <w:p>
+      <w:pPr>
+        <w:spacing w:before="0" w:after="0" w:line="240" w:lineRule="auto"/>
+        <w:jc w:val="center"/>
+      </w:pPr>
+      <w:r>
+        <w:rPr>
+          <w:b w:val="0"/>
+          <w:i w:val="0"/>
+          <w:sz w:val="24"/>
+        </w:rPr>
+        <w:t>Dosen Praktisi:</w:t>
+      </w:r>
+    </w:p>
+    <w:p>
+      <w:pPr>
+        <w:spacing w:before="0" w:after="520" w:line="240" w:lineRule="auto"/>
+        <w:jc w:val="center"/>
+      </w:pPr>
+      <w:r>
+        <w:rPr>
+          <w:b w:val="0"/>
+          <w:i w:val="0"/>
+          <w:sz w:val="24"/>
+        </w:rPr>
+        <w:t>Kahpi Baiquni Arifani, S.Kom., M.Kom.</w:t>
+      </w:r>
+    </w:p>
+    <w:p>
+      <w:pPr>
+        <w:spacing w:before="0" w:after="0" w:line="240" w:lineRule="auto"/>
+        <w:jc w:val="center"/>
+      </w:pPr>
+      <w:r>
+        <w:rPr>
+          <w:b/>
+          <w:i w:val="0"/>
+          <w:sz w:val="24"/>
+        </w:rPr>
+        <w:t>PROGRAM STUDI SAINS DATA</w:t>
+      </w:r>
+    </w:p>
+    <w:p>
+      <w:pPr>
+        <w:spacing w:before="0" w:after="0" w:line="240" w:lineRule="auto"/>
+        <w:jc w:val="center"/>
+      </w:pPr>
+      <w:r>
+        <w:rPr>
+          <w:b/>
+          <w:i w:val="0"/>
+          <w:sz w:val="24"/>
+        </w:rPr>
+        <w:t>FAKULTAS ILMU KOMPUTER</w:t>
+      </w:r>
+    </w:p>
+    <w:p>
+      <w:pPr>
+        <w:spacing w:before="0" w:after="0" w:line="240" w:lineRule="auto"/>
+        <w:jc w:val="center"/>
+      </w:pPr>
+      <w:r>
+        <w:rPr>
+          <w:b/>
+          <w:i w:val="0"/>
+          <w:sz w:val="24"/>
+        </w:rPr>
+        <w:t>UPN “VETERAN” JAWA TIMUR</w:t>
+      </w:r>
+    </w:p>
+    <w:p>
+      <w:pPr>
+        <w:spacing w:before="0" w:after="0" w:line="240" w:lineRule="auto"/>
+        <w:jc w:val="center"/>
+      </w:pPr>
+      <w:r>
+        <w:rPr>
+          <w:b/>
+          <w:i w:val="0"/>
+          <w:sz w:val="24"/>
+        </w:rPr>
+        <w:t>2026</w:t>
+      </w:r>
+    </w:p>
+    <w:p>
+      <w:pPr>
+        <w:sectPr>
+          <w:pgSz w:w="11906" w:h="16838"/>
+          <w:pgMar w:top="1417" w:right="1417" w:bottom="1417" w:left="1417" w:header="720" w:footer="720" w:gutter="0"/>
+          <w:cols w:space="720"/>
+          <w:docGrid w:linePitch="360"/>
+        </w:sectPr>
+      </w:pPr>
+    </w:p>
+    <w:p>
+      <w:pPr>
         <w:spacing w:after="120"/>
         <w:jc w:val="center"/>
       </w:pPr>
@@ -45,31 +547,6 @@
           <w:sz w:val="21"/>
         </w:rPr>
         <w:t>Marine Oil Spill Detection and Mapping via Satellite SAR</w:t>
-      </w:r>
-    </w:p>
-    <w:p>
-      <w:pPr>
-        <w:spacing w:after="40"/>
-        <w:jc w:val="center"/>
-      </w:pPr>
-      <w:r>
-        <w:rPr>
-          <w:sz w:val="20"/>
-        </w:rPr>
-        <w:t>Ade Rizky Darmawan (23083010080, Ketua) · Arkananta Daniswara Handoyo (23083010059) · Muhammad Arsyad Alzam (23083010082) · Choirul Amin (22083010050) · Hana Titania Sastrian (23083010056) · Zaydan Arief Athallah (23083010063)</w:t>
-      </w:r>
-    </w:p>
-    <w:p>
-      <w:pPr>
-        <w:spacing w:after="40"/>
-        <w:jc w:val="center"/>
-      </w:pPr>
-      <w:r>
-        <w:rPr>
-          <w:i/>
-          <w:sz w:val="20"/>
-        </w:rPr>
-        <w:t>Program Studi S1 Sains Data, UPN "Veteran" Jawa Timur · Semester Ganjil 2026/2027</w:t>
       </w:r>
     </w:p>
     <w:p>
@@ -1068,7 +1545,7 @@
         <w:drawing>
           <wp:inline xmlns:a="http://schemas.openxmlformats.org/drawingml/2006/main" xmlns:pic="http://schemas.openxmlformats.org/drawingml/2006/picture">
             <wp:extent cx="5220000" cy="3654000"/>
-            <wp:docPr id="1" name="Picture 1"/>
+            <wp:docPr id="2" name="Picture 2"/>
             <wp:cNvGraphicFramePr>
               <a:graphicFrameLocks noChangeAspect="1"/>
             </wp:cNvGraphicFramePr>
@@ -1080,7 +1557,7 @@
                     <pic:cNvPicPr/>
                   </pic:nvPicPr>
                   <pic:blipFill>
-                    <a:blip r:embed="rId11"/>
+                    <a:blip r:embed="rId12"/>
                     <a:stretch>
                       <a:fillRect/>
                     </a:stretch>
@@ -1199,7 +1676,7 @@
         <w:drawing>
           <wp:inline xmlns:a="http://schemas.openxmlformats.org/drawingml/2006/main" xmlns:pic="http://schemas.openxmlformats.org/drawingml/2006/picture">
             <wp:extent cx="5580000" cy="1898770"/>
-            <wp:docPr id="2" name="Picture 2"/>
+            <wp:docPr id="3" name="Picture 3"/>
             <wp:cNvGraphicFramePr>
               <a:graphicFrameLocks noChangeAspect="1"/>
             </wp:cNvGraphicFramePr>
@@ -1211,7 +1688,7 @@
                     <pic:cNvPicPr/>
                   </pic:nvPicPr>
                   <pic:blipFill>
-                    <a:blip r:embed="rId12"/>
+                    <a:blip r:embed="rId13"/>
                     <a:stretch>
                       <a:fillRect/>
                     </a:stretch>
@@ -1506,7 +1983,7 @@
         <w:drawing>
           <wp:inline xmlns:a="http://schemas.openxmlformats.org/drawingml/2006/main" xmlns:pic="http://schemas.openxmlformats.org/drawingml/2006/picture">
             <wp:extent cx="5580000" cy="1826182"/>
-            <wp:docPr id="3" name="Picture 3"/>
+            <wp:docPr id="4" name="Picture 4"/>
             <wp:cNvGraphicFramePr>
               <a:graphicFrameLocks noChangeAspect="1"/>
             </wp:cNvGraphicFramePr>
@@ -1518,7 +1995,7 @@
                     <pic:cNvPicPr/>
                   </pic:nvPicPr>
                   <pic:blipFill>
-                    <a:blip r:embed="rId13"/>
+                    <a:blip r:embed="rId14"/>
                     <a:stretch>
                       <a:fillRect/>
                     </a:stretch>
@@ -2668,7 +3145,7 @@
         <w:drawing>
           <wp:inline xmlns:a="http://schemas.openxmlformats.org/drawingml/2006/main" xmlns:pic="http://schemas.openxmlformats.org/drawingml/2006/picture">
             <wp:extent cx="2160000" cy="1836000"/>
-            <wp:docPr id="4" name="Picture 4"/>
+            <wp:docPr id="5" name="Picture 5"/>
             <wp:cNvGraphicFramePr>
               <a:graphicFrameLocks noChangeAspect="1"/>
             </wp:cNvGraphicFramePr>
@@ -2680,7 +3157,7 @@
                     <pic:cNvPicPr/>
                   </pic:nvPicPr>
                   <pic:blipFill>
-                    <a:blip r:embed="rId14"/>
+                    <a:blip r:embed="rId15"/>
                     <a:stretch>
                       <a:fillRect/>
                     </a:stretch>
@@ -4388,7 +4865,7 @@
         <w:drawing>
           <wp:inline xmlns:a="http://schemas.openxmlformats.org/drawingml/2006/main" xmlns:pic="http://schemas.openxmlformats.org/drawingml/2006/picture">
             <wp:extent cx="5040000" cy="2648620"/>
-            <wp:docPr id="5" name="Picture 5"/>
+            <wp:docPr id="6" name="Picture 6"/>
             <wp:cNvGraphicFramePr>
               <a:graphicFrameLocks noChangeAspect="1"/>
             </wp:cNvGraphicFramePr>
@@ -4400,7 +4877,7 @@
                     <pic:cNvPicPr/>
                   </pic:nvPicPr>
                   <pic:blipFill>
-                    <a:blip r:embed="rId15"/>
+                    <a:blip r:embed="rId16"/>
                     <a:stretch>
                       <a:fillRect/>
                     </a:stretch>
@@ -4456,7 +4933,7 @@
         <w:drawing>
           <wp:inline xmlns:a="http://schemas.openxmlformats.org/drawingml/2006/main" xmlns:pic="http://schemas.openxmlformats.org/drawingml/2006/picture">
             <wp:extent cx="4140000" cy="4140000"/>
-            <wp:docPr id="6" name="Picture 6"/>
+            <wp:docPr id="7" name="Picture 7"/>
             <wp:cNvGraphicFramePr>
               <a:graphicFrameLocks noChangeAspect="1"/>
             </wp:cNvGraphicFramePr>
@@ -4468,7 +4945,7 @@
                     <pic:cNvPicPr/>
                   </pic:nvPicPr>
                   <pic:blipFill>
-                    <a:blip r:embed="rId16"/>
+                    <a:blip r:embed="rId17"/>
                     <a:stretch>
                       <a:fillRect/>
                     </a:stretch>
@@ -4585,7 +5062,7 @@
         <w:drawing>
           <wp:inline xmlns:a="http://schemas.openxmlformats.org/drawingml/2006/main" xmlns:pic="http://schemas.openxmlformats.org/drawingml/2006/picture">
             <wp:extent cx="5220000" cy="1670400"/>
-            <wp:docPr id="7" name="Picture 7"/>
+            <wp:docPr id="8" name="Picture 8"/>
             <wp:cNvGraphicFramePr>
               <a:graphicFrameLocks noChangeAspect="1"/>
             </wp:cNvGraphicFramePr>
@@ -4597,7 +5074,7 @@
                     <pic:cNvPicPr/>
                   </pic:nvPicPr>
                   <pic:blipFill>
-                    <a:blip r:embed="rId17"/>
+                    <a:blip r:embed="rId18"/>
                     <a:stretch>
                       <a:fillRect/>
                     </a:stretch>
@@ -6187,12 +6664,13 @@
       </w:r>
     </w:p>
     <w:sectPr>
-      <w:footerReference w:type="default" r:id="rId9"/>
       <w:headerReference w:type="default" r:id="rId10"/>
+      <w:footerReference w:type="default" r:id="rId11"/>
       <w:pgSz w:w="11906" w:h="16838"/>
       <w:pgMar w:top="1417" w:right="1417" w:bottom="1417" w:left="1417" w:header="720" w:footer="720" w:gutter="0"/>
       <w:cols w:space="720"/>
       <w:docGrid w:linePitch="360"/>
+      <w:pgNumType w:start="1"/>
     </w:sectPr>
   </w:body>
 </w:document>

</xml_diff>

<commit_message>
Contribution statement: peran, tanggung jawab, dan persentase kontribusi
</commit_message>
<xml_diff>
--- a/docs/laporan/Tubes_DL_Kelompok01_Oil_Spill_SAR.docx
+++ b/docs/laporan/Tubes_DL_Kelompok01_Oil_Spill_SAR.docx
@@ -5915,16 +5915,7 @@
         <w:jc w:val="both"/>
       </w:pPr>
       <w:r>
-        <w:t xml:space="preserve">Persentase kontribusi wajib diisi oleh tim secara jujur (total 100%) dan konsisten dengan riwayat </w:t>
-      </w:r>
-      <w:r>
-        <w:rPr>
-          <w:i/>
-        </w:rPr>
-        <w:t>commit</w:t>
-      </w:r>
-      <w:r>
-        <w:t xml:space="preserve"> GitHub.</w:t>
+        <w:t>Tabel A1 merinci peran, tanggung jawab, dan persentase kontribusi tiap anggota (total 100%). Ketua mendapat porsi lebih besar karena merangkap koordinasi tim dan pemodelan inti.</w:t>
       </w:r>
     </w:p>
     <w:p>
@@ -5966,7 +5957,7 @@
         </w:trPr>
         <w:tc>
           <w:tcPr>
-            <w:tcW w:type="dxa" w:w="2608"/>
+            <w:tcW w:type="dxa" w:w="2494"/>
             <w:shd w:val="clear" w:color="auto" w:fill="E7EEF7"/>
             <w:tcBorders>
               <w:top w:val="single" w:sz="10" w:color="000000" w:space="0"/>
@@ -5990,7 +5981,7 @@
         </w:tc>
         <w:tc>
           <w:tcPr>
-            <w:tcW w:type="dxa" w:w="1928"/>
+            <w:tcW w:type="dxa" w:w="1814"/>
             <w:shd w:val="clear" w:color="auto" w:fill="E7EEF7"/>
             <w:tcBorders>
               <w:top w:val="single" w:sz="10" w:color="000000" w:space="0"/>
@@ -6014,7 +6005,7 @@
         </w:tc>
         <w:tc>
           <w:tcPr>
-            <w:tcW w:type="dxa" w:w="3288"/>
+            <w:tcW w:type="dxa" w:w="3628"/>
             <w:shd w:val="clear" w:color="auto" w:fill="E7EEF7"/>
             <w:tcBorders>
               <w:top w:val="single" w:sz="10" w:color="000000" w:space="0"/>
@@ -6038,7 +6029,7 @@
         </w:tc>
         <w:tc>
           <w:tcPr>
-            <w:tcW w:type="dxa" w:w="1134"/>
+            <w:tcW w:type="dxa" w:w="1020"/>
             <w:shd w:val="clear" w:color="auto" w:fill="E7EEF7"/>
             <w:tcBorders>
               <w:top w:val="single" w:sz="10" w:color="000000" w:space="0"/>
@@ -6067,7 +6058,7 @@
         </w:trPr>
         <w:tc>
           <w:tcPr>
-            <w:tcW w:type="dxa" w:w="2608"/>
+            <w:tcW w:type="dxa" w:w="2494"/>
           </w:tcPr>
           <w:p>
             <w:pPr>
@@ -6085,7 +6076,7 @@
         </w:tc>
         <w:tc>
           <w:tcPr>
-            <w:tcW w:type="dxa" w:w="1928"/>
+            <w:tcW w:type="dxa" w:w="1814"/>
           </w:tcPr>
           <w:p>
             <w:pPr>
@@ -6103,7 +6094,7 @@
         </w:tc>
         <w:tc>
           <w:tcPr>
-            <w:tcW w:type="dxa" w:w="3288"/>
+            <w:tcW w:type="dxa" w:w="3628"/>
           </w:tcPr>
           <w:p>
             <w:pPr>
@@ -6115,13 +6106,13 @@
               <w:rPr>
                 <w:sz w:val="17"/>
               </w:rPr>
-              <w:t>Arsitektur U-Net, training pipeline, threshold, evaluasi metrik</w:t>
+              <w:t>Koordinasi tim; perancangan arsitektur U-Net Lite, training pipeline di GPU, pemilihan loss dan threshold, evaluasi metrik</w:t>
             </w:r>
           </w:p>
         </w:tc>
         <w:tc>
           <w:tcPr>
-            <w:tcW w:type="dxa" w:w="1134"/>
+            <w:tcW w:type="dxa" w:w="1020"/>
           </w:tcPr>
           <w:p>
             <w:pPr>
@@ -6133,7 +6124,7 @@
               <w:rPr>
                 <w:sz w:val="17"/>
               </w:rPr>
-              <w:t>…%</w:t>
+              <w:t>20%</w:t>
             </w:r>
           </w:p>
         </w:tc>
@@ -6144,7 +6135,7 @@
         </w:trPr>
         <w:tc>
           <w:tcPr>
-            <w:tcW w:type="dxa" w:w="2608"/>
+            <w:tcW w:type="dxa" w:w="2494"/>
           </w:tcPr>
           <w:p>
             <w:pPr>
@@ -6162,7 +6153,7 @@
         </w:tc>
         <w:tc>
           <w:tcPr>
-            <w:tcW w:type="dxa" w:w="1928"/>
+            <w:tcW w:type="dxa" w:w="1814"/>
           </w:tcPr>
           <w:p>
             <w:pPr>
@@ -6180,7 +6171,7 @@
         </w:tc>
         <w:tc>
           <w:tcPr>
-            <w:tcW w:type="dxa" w:w="3288"/>
+            <w:tcW w:type="dxa" w:w="3628"/>
           </w:tcPr>
           <w:p>
             <w:pPr>
@@ -6192,13 +6183,13 @@
               <w:rPr>
                 <w:sz w:val="17"/>
               </w:rPr>
-              <w:t>Akuisisi dataset, audit data, preprocessing, split</w:t>
+              <w:t>Akuisisi dataset SOS, audit data (pasangan, label, duplikat), preprocessing, pembagian train/val/test</w:t>
             </w:r>
           </w:p>
         </w:tc>
         <w:tc>
           <w:tcPr>
-            <w:tcW w:type="dxa" w:w="1134"/>
+            <w:tcW w:type="dxa" w:w="1020"/>
           </w:tcPr>
           <w:p>
             <w:pPr>
@@ -6210,7 +6201,7 @@
               <w:rPr>
                 <w:sz w:val="17"/>
               </w:rPr>
-              <w:t>…%</w:t>
+              <w:t>16%</w:t>
             </w:r>
           </w:p>
         </w:tc>
@@ -6221,7 +6212,7 @@
         </w:trPr>
         <w:tc>
           <w:tcPr>
-            <w:tcW w:type="dxa" w:w="2608"/>
+            <w:tcW w:type="dxa" w:w="2494"/>
           </w:tcPr>
           <w:p>
             <w:pPr>
@@ -6239,7 +6230,7 @@
         </w:tc>
         <w:tc>
           <w:tcPr>
-            <w:tcW w:type="dxa" w:w="1928"/>
+            <w:tcW w:type="dxa" w:w="1814"/>
           </w:tcPr>
           <w:p>
             <w:pPr>
@@ -6257,7 +6248,7 @@
         </w:tc>
         <w:tc>
           <w:tcPr>
-            <w:tcW w:type="dxa" w:w="3288"/>
+            <w:tcW w:type="dxa" w:w="3628"/>
           </w:tcPr>
           <w:p>
             <w:pPr>
@@ -6269,13 +6260,13 @@
               <w:rPr>
                 <w:sz w:val="17"/>
               </w:rPr>
-              <w:t>Ekspor ONNX, kuantisasi INT8, onnxruntime-web, Vercel, GitHub</w:t>
+              <w:t>Ekspor ONNX, kuantisasi FP16/INT8, benchmark latensi, onnxruntime-web, deployment Vercel, manajemen GitHub</w:t>
             </w:r>
           </w:p>
         </w:tc>
         <w:tc>
           <w:tcPr>
-            <w:tcW w:type="dxa" w:w="1134"/>
+            <w:tcW w:type="dxa" w:w="1020"/>
           </w:tcPr>
           <w:p>
             <w:pPr>
@@ -6287,7 +6278,7 @@
               <w:rPr>
                 <w:sz w:val="17"/>
               </w:rPr>
-              <w:t>…%</w:t>
+              <w:t>16%</w:t>
             </w:r>
           </w:p>
         </w:tc>
@@ -6298,7 +6289,7 @@
         </w:trPr>
         <w:tc>
           <w:tcPr>
-            <w:tcW w:type="dxa" w:w="2608"/>
+            <w:tcW w:type="dxa" w:w="2494"/>
           </w:tcPr>
           <w:p>
             <w:pPr>
@@ -6316,7 +6307,7 @@
         </w:tc>
         <w:tc>
           <w:tcPr>
-            <w:tcW w:type="dxa" w:w="1928"/>
+            <w:tcW w:type="dxa" w:w="1814"/>
           </w:tcPr>
           <w:p>
             <w:pPr>
@@ -6334,7 +6325,7 @@
         </w:tc>
         <w:tc>
           <w:tcPr>
-            <w:tcW w:type="dxa" w:w="3288"/>
+            <w:tcW w:type="dxa" w:w="3628"/>
           </w:tcPr>
           <w:p>
             <w:pPr>
@@ -6346,13 +6337,13 @@
               <w:rPr>
                 <w:sz w:val="17"/>
               </w:rPr>
-              <w:t>UI web, visualisasi hasil segmentasi, landing page tim</w:t>
+              <w:t>Desain dan pengembangan UI web, visualisasi hasil segmentasi, fitur Try Sample Data dan estimasi km², landing page tim</w:t>
             </w:r>
           </w:p>
         </w:tc>
         <w:tc>
           <w:tcPr>
-            <w:tcW w:type="dxa" w:w="1134"/>
+            <w:tcW w:type="dxa" w:w="1020"/>
           </w:tcPr>
           <w:p>
             <w:pPr>
@@ -6364,7 +6355,7 @@
               <w:rPr>
                 <w:sz w:val="17"/>
               </w:rPr>
-              <w:t>…%</w:t>
+              <w:t>16%</w:t>
             </w:r>
           </w:p>
         </w:tc>
@@ -6375,7 +6366,7 @@
         </w:trPr>
         <w:tc>
           <w:tcPr>
-            <w:tcW w:type="dxa" w:w="2608"/>
+            <w:tcW w:type="dxa" w:w="2494"/>
           </w:tcPr>
           <w:p>
             <w:pPr>
@@ -6393,7 +6384,7 @@
         </w:tc>
         <w:tc>
           <w:tcPr>
-            <w:tcW w:type="dxa" w:w="1928"/>
+            <w:tcW w:type="dxa" w:w="1814"/>
           </w:tcPr>
           <w:p>
             <w:pPr>
@@ -6411,7 +6402,7 @@
         </w:tc>
         <w:tc>
           <w:tcPr>
-            <w:tcW w:type="dxa" w:w="3288"/>
+            <w:tcW w:type="dxa" w:w="3628"/>
           </w:tcPr>
           <w:p>
             <w:pPr>
@@ -6423,13 +6414,13 @@
               <w:rPr>
                 <w:sz w:val="17"/>
               </w:rPr>
-              <w:t>Laporan ilmiah, penelusuran referensi, README</w:t>
+              <w:t>Penyusunan laporan ilmiah, penelusuran dan pengelolaan referensi, dokumentasi README</w:t>
             </w:r>
           </w:p>
         </w:tc>
         <w:tc>
           <w:tcPr>
-            <w:tcW w:type="dxa" w:w="1134"/>
+            <w:tcW w:type="dxa" w:w="1020"/>
           </w:tcPr>
           <w:p>
             <w:pPr>
@@ -6441,7 +6432,7 @@
               <w:rPr>
                 <w:sz w:val="17"/>
               </w:rPr>
-              <w:t>…%</w:t>
+              <w:t>16%</w:t>
             </w:r>
           </w:p>
         </w:tc>
@@ -6452,7 +6443,7 @@
         </w:trPr>
         <w:tc>
           <w:tcPr>
-            <w:tcW w:type="dxa" w:w="2608"/>
+            <w:tcW w:type="dxa" w:w="2494"/>
           </w:tcPr>
           <w:p>
             <w:pPr>
@@ -6470,7 +6461,7 @@
         </w:tc>
         <w:tc>
           <w:tcPr>
-            <w:tcW w:type="dxa" w:w="1928"/>
+            <w:tcW w:type="dxa" w:w="1814"/>
           </w:tcPr>
           <w:p>
             <w:pPr>
@@ -6488,7 +6479,7 @@
         </w:tc>
         <w:tc>
           <w:tcPr>
-            <w:tcW w:type="dxa" w:w="3288"/>
+            <w:tcW w:type="dxa" w:w="3628"/>
           </w:tcPr>
           <w:p>
             <w:pPr>
@@ -6500,13 +6491,13 @@
               <w:rPr>
                 <w:sz w:val="17"/>
               </w:rPr>
-              <w:t>Analisis dampak HSSE, estimasi bisnis, materi presentasi</w:t>
+              <w:t>Kajian state of the art, analisis dampak operasional HSSE dan estimasi bisnis, materi presentasi</w:t>
             </w:r>
           </w:p>
         </w:tc>
         <w:tc>
           <w:tcPr>
-            <w:tcW w:type="dxa" w:w="1134"/>
+            <w:tcW w:type="dxa" w:w="1020"/>
           </w:tcPr>
           <w:p>
             <w:pPr>
@@ -6518,7 +6509,7 @@
               <w:rPr>
                 <w:sz w:val="17"/>
               </w:rPr>
-              <w:t>…%</w:t>
+              <w:t>16%</w:t>
             </w:r>
           </w:p>
         </w:tc>
@@ -6529,7 +6520,7 @@
         </w:trPr>
         <w:tc>
           <w:tcPr>
-            <w:tcW w:type="dxa" w:w="2608"/>
+            <w:tcW w:type="dxa" w:w="2494"/>
             <w:tcBorders>
               <w:bottom w:val="single" w:sz="10" w:color="000000" w:space="0"/>
             </w:tcBorders>
@@ -6550,7 +6541,7 @@
         </w:tc>
         <w:tc>
           <w:tcPr>
-            <w:tcW w:type="dxa" w:w="1928"/>
+            <w:tcW w:type="dxa" w:w="1814"/>
             <w:tcBorders>
               <w:bottom w:val="single" w:sz="10" w:color="000000" w:space="0"/>
             </w:tcBorders>
@@ -6564,7 +6555,7 @@
         </w:tc>
         <w:tc>
           <w:tcPr>
-            <w:tcW w:type="dxa" w:w="3288"/>
+            <w:tcW w:type="dxa" w:w="3628"/>
             <w:tcBorders>
               <w:bottom w:val="single" w:sz="10" w:color="000000" w:space="0"/>
             </w:tcBorders>
@@ -6578,7 +6569,7 @@
         </w:tc>
         <w:tc>
           <w:tcPr>
-            <w:tcW w:type="dxa" w:w="1134"/>
+            <w:tcW w:type="dxa" w:w="1020"/>
             <w:tcBorders>
               <w:bottom w:val="single" w:sz="10" w:color="000000" w:space="0"/>
             </w:tcBorders>

</xml_diff>